<commit_message>
Regenerate the design document outputs
Co-Authored-By: Claude Fable 5.1 <noreply@anthropic.com>
Claude-Session: https://claude.ai/code/session_01XxoFBNcbz8v1DzJTELYzxk
</commit_message>
<xml_diff>
--- a/hopper/3d/design/Hopper_3D_Design.docx
+++ b/hopper/3d/design/Hopper_3D_Design.docx
@@ -12557,6 +12557,20 @@
     <w:p>
       <w:r>
         <w:t>Inversion is a volume, not a screen: passing a gravity gate or a seam under an arch flips local gravity for whatever is inside, Hopper rotates over 0.25 s to the new surface, the camera keeps the horizon, and the seam arrows show the way out. Cantors flip a marked volume beneath them; they never flip the whole district.</w:t>
+      </w:r>
+    </w:p>
+    <w:p>
+      <w:r>
+        <w:t xml:space="preserve">As built: a seam stands as a permanent flip volume from a hop's height up past its lintel, so walking under it does nothing and a hop enters it; inside, the controller steps Hopper in the world's mirror, so he falls up, lands on undersides, jumps down off them and climbs the piers back down. A turn halves his vertical speed, so a fall out of a seam's top settles at its edge. The commanders set the arena's gravity while they are awake; the Regent's third phase turns it upward toward the eclipse canopy over the dais. </w:t>
+      </w:r>
+      <w:r>
+        <w:rPr>
+          <w:rFonts w:ascii="Consolas" w:hAnsi="Consolas"/>
+        </w:rPr>
+        <w:t>LEVEL-PLAN-M2-M3.md</w:t>
+      </w:r>
+      <w:r>
+        <w:t xml:space="preserve"> records the rest of what missions two and three built.</w:t>
       </w:r>
     </w:p>
     <w:p>

</xml_diff>

<commit_message>
Shadow halo: the shadows as feathered dark spots on the picture
An optional pass (the Shadow halo setting, on by default in the 3D
edition) draws the frame into a target, renders the shadows' silhouettes
to a mask against that frame's depth, blurs the mask at a quarter of the
resolution and lays it back over the picture as a violet darkness that
hugs each silhouette and bleeds a little into its surroundings; a shadow
behind a wall leaves no spot. The design records the stand-in pass and the
halo; the contact sheets are re-rendered from the reshaped creatures. A
coral spire moves within reach of each Vermilion stronghold now that the
rib arch is the half ring its author drew.

Co-Authored-By: Claude Fable 5.1 <noreply@anthropic.com>
Claude-Session: https://claude.ai/code/session_01XxoFBNcbz8v1DzJTELYzxk
</commit_message>
<xml_diff>
--- a/hopper/3d/design/Hopper_3D_Design.docx
+++ b/hopper/3d/design/Hopper_3D_Design.docx
@@ -7587,6 +7587,11 @@
       </w:pPr>
       <w:r>
         <w:t>Stand-in silhouettes for all eighteen species on a contact sheet; the final models are requests M-003 to M-020.</w:t>
+      </w:r>
+    </w:p>
+    <w:p>
+      <w:r>
+        <w:t>The shadows are drawn as dark spots on the picture: an optional pass (the "Shadow halo" setting, on by default) renders their silhouettes to a mask against the frame's own depth, blurs it at a quarter of the resolution and lays it back over the frame as a feathered violet darkness that hugs each silhouette and bleeds a little into what stands around it. Nothing inside the silhouette changes but a touch of darkening, so cores, eyes and tells still read; a shadow behind a wall leaves no spot.</w:t>
       </w:r>
     </w:p>
     <w:tbl>
@@ -14933,6 +14938,20 @@
       </w:r>
       <w:r>
         <w:t>. They are the same size as the requested model, expose the same named sockets, publish the same landings and animate a little, so gameplay code binds to names that survive the swap. Textures are painted in code into data textures, skies are gradient-plus-sun paintings, terrain is a heightfield whose colour and collision share one function, and the horizon is a ring of silhouettes in the haze colour.</w:t>
+      </w:r>
+    </w:p>
+    <w:p>
+      <w:r>
+        <w:t xml:space="preserve">The creature stand-ins are shaped to the turnaround sheets in </w:t>
+      </w:r>
+      <w:r>
+        <w:rPr>
+          <w:rFonts w:ascii="Consolas" w:hAnsi="Consolas"/>
+        </w:rPr>
+        <w:t>design/references</w:t>
+      </w:r>
+      <w:r>
+        <w:t xml:space="preserve"> rather than left as blocks: plated bodies drawn in profile and extruded, rib arcs, crests, claws and horns cut from outlines, tapered strands for tails and tendrils, lathes for bells, pots and shells, feathered wings on jointed bones. They are still shadow — black plates, violet seams, ivory teeth and cores — so the game can play with them until the delivered models arrive.</w:t>
       </w:r>
     </w:p>
     <w:p>

</xml_diff>

<commit_message>
A longer leap with the mighty jump; the camera keeps pace with taller hops
The takeoff lunge grows to 34 m/s so a running jump still travels three
times its 45 m apex. The camera's look point and eye never climb or drop
faster than 66 m/s and close a wide gap more gently, so the taller arcs
land without a jolt. The design records the jump, the walk band and the
fights that come up from below; documents regenerated.

Co-Authored-By: Claude Fable 5.1 <noreply@anthropic.com>
Claude-Session: https://claude.ai/code/session_01XxoFBNcbz8v1DzJTELYzxk
</commit_message>
<xml_diff>
--- a/hopper/3d/design/Hopper_3D_Design.docx
+++ b/hopper/3d/design/Hopper_3D_Design.docx
@@ -6233,6 +6233,11 @@
     <w:p>
       <w:r>
         <w:t>Hopper always faces forward: along the trail, or wherever the camera's manual turn points, or at a locked target. Pulling the stick back is a backpedal at half speed, sideways is a strafe, and the dash, the hop back and the wall kick are manoeuvres that keep the facing. Turning round is the camera's job, never the stick's, so the rider is always looking where the danger is.</w:t>
+      </w:r>
+    </w:p>
+    <w:p>
+      <w:r>
+        <w:t>As built: the tap is a mighty kick — 104 m/s off the ground, a 45 m apex, 57 m with the short hold — and the fall pulls harder (1.4×), so the arc is quick up and sharp down; the crouch charge reaches 190 m. The stick's lower band (to 55 % of its throw) walks at up to 34 m/s and its upper band gallops to 68 m/s, twice the walk, with the sprint on top.</w:t>
       </w:r>
     </w:p>
     <w:p>
@@ -7429,6 +7434,11 @@
       </w:pPr>
       <w:r>
         <w:t>Fighting in the air</w:t>
+      </w:r>
+    </w:p>
+    <w:p>
+      <w:r>
+        <w:t>The fight comes up at Hopper, not down on him: once he is near, window rays, rift condors and chain mantas drop below him (never lower than a body above the ground, never above their own perch) and their dives rise to meet him, while the rooted shooters lob and beam upward from where they stand. The super jump and the way down — stomps, kicks, dives — are the answer; aiming upward is never the game.</w:t>
       </w:r>
     </w:p>
     <w:p>

</xml_diff>